<commit_message>
Dissertation: trial builds; ignore preview images
Co-Authored-By: Claude Opus 5.5 <noreply@anthropic.com>
Claude-Session: https://claude.ai/code/session_01WcXt6iEQKTpJkT13ui6H64
</commit_message>
<xml_diff>
--- a/dissertation/build/reference.docx
+++ b/dissertation/build/reference.docx
@@ -1143,7 +1143,7 @@
       <w:rFonts w:ascii="Courier New" w:hAnsi="Courier New" w:cs="Courier New" w:eastAsia="Courier New"/>
       <w:i w:val="0"/>
       <w:color w:val="000000"/>
-      <w:sz w:val="18"/>
+      <w:sz w:val="16"/>
     </w:rPr>
   </w:style>
   <w:style w:type="paragraph" w:customStyle="1" w:styleId="Reference">
@@ -1152,7 +1152,7 @@
     <w:pPr>
       <w:keepNext w:val="0"/>
       <w:widowControl/>
-      <w:spacing w:line="240" w:lineRule="auto" w:before="0" w:after="80"/>
+      <w:spacing w:line="240" w:lineRule="auto" w:before="0" w:after="40"/>
       <w:ind w:left="425" w:hanging="425"/>
       <w:jc w:val="both"/>
     </w:pPr>
@@ -1160,7 +1160,7 @@
       <w:rFonts w:ascii="Times New Roman" w:hAnsi="Times New Roman" w:cs="Times New Roman" w:eastAsia="Times New Roman"/>
       <w:i w:val="0"/>
       <w:color w:val="000000"/>
-      <w:sz w:val="26"/>
+      <w:sz w:val="24"/>
     </w:rPr>
   </w:style>
   <w:style w:type="paragraph" w:customStyle="1" w:styleId="TitleCenter">

</xml_diff>